<commit_message>
feat: update SARL template loops, signature mode, and defaults guide
</commit_message>
<xml_diff>
--- a/Models/SARL AU/SARL-AU_2026-03_Statuts_Template.docx
+++ b/Models/SARL AU/SARL-AU_2026-03_Statuts_Template.docx
@@ -4667,6 +4667,14 @@
     <w:p>
       <w:pPr>
         <w:pStyle w:val="Titre7"/>
+      </w:pPr>
+      <w:r>
+        <w:t>{{CIVILITE_ASSOCIE}} {{PRENOM_ASSOCIE}} {{NOM_ASSOCIE}}</w:t>
+      </w:r>
+    </w:p>
+    <w:p>
+      <w:pPr>
+        <w:pStyle w:val="Titre7"/>
         <w:numPr>
           <w:ilvl w:val="12"/>
           <w:numId w:val="0"/>
@@ -4682,34 +4690,6 @@
         </w:rPr>
       </w:pPr>
       <w:r>
-        <w:rPr>
-          <w:rFonts w:ascii="Aptos" w:hAnsi="Aptos" w:cstheme="majorBidi"/>
-          <w:bCs/>
-          <w:sz w:val="22"/>
-          <w:szCs w:val="22"/>
-          <w:u w:val="none"/>
-          <w:lang w:val="fr-FR"/>
-        </w:rPr>
-        <w:t xml:space="preserve">{{CIVILITE_ASSOCIE}} {{PRENOM_ASSOCIE}} {{NOM_ASSOCIE}} </w:t>
-      </w:r>
-    </w:p>
-    <w:p>
-      <w:pPr>
-        <w:jc w:val="center"/>
-        <w:rPr>
-          <w:rFonts w:ascii="Aptos" w:hAnsi="Aptos"/>
-          <w:lang w:val="fr-CA"/>
-        </w:rPr>
-      </w:pPr>
-      <w:r>
-        <w:rPr>
-          <w:rFonts w:ascii="Aptos" w:hAnsi="Aptos" w:cs="Times New Roman"/>
-          <w:b/>
-          <w:sz w:val="24"/>
-          <w:szCs w:val="20"/>
-          <w:u w:val="single"/>
-          <w:lang w:val="fr-CA"/>
-        </w:rPr>
         <w:t>{{QUALITE_GERANT}}</w:t>
       </w:r>
     </w:p>

</xml_diff>